<commit_message>
Use full names of contributors in README and informe
Replace short first names/nicknames with full names as provided,
and regenerate the Word report to match.
</commit_message>
<xml_diff>
--- a/out/Informe_Practica1_NoticiasFalsas.docx
+++ b/out/Informe_Practica1_NoticiasFalsas.docx
@@ -797,7 +797,7 @@
           <w:b/>
           <w:bCs/>
         </w:rPr>
-        <w:t xml:space="preserve">David</w:t>
+        <w:t xml:space="preserve">Juan David Cortés</w:t>
       </w:r>
       <w:r>
         <w:t xml:space="preserve">:</w:t>
@@ -831,7 +831,7 @@
           <w:b/>
           <w:bCs/>
         </w:rPr>
-        <w:t xml:space="preserve">Jessi</w:t>
+        <w:t xml:space="preserve">Jessica Paola Vega</w:t>
       </w:r>
       <w:r>
         <w:t xml:space="preserve">:</w:t>
@@ -865,7 +865,7 @@
           <w:b/>
           <w:bCs/>
         </w:rPr>
-        <w:t xml:space="preserve">Jonatan</w:t>
+        <w:t xml:space="preserve">Jonatan Estiven Sánchez</w:t>
       </w:r>
       <w:r>
         <w:t xml:space="preserve">:</w:t>
@@ -899,7 +899,7 @@
           <w:b/>
           <w:bCs/>
         </w:rPr>
-        <w:t xml:space="preserve">Josué</w:t>
+        <w:t xml:space="preserve">Josue Duque</w:t>
       </w:r>
       <w:r>
         <w:t xml:space="preserve">:</w:t>
@@ -6571,7 +6571,7 @@
         <w:rPr>
           <w:rStyle w:val="VerbatimChar"/>
         </w:rPr>
-        <w:t xml:space="preserve">│   ├── David/, Jessi/, Jonatan/, Josue/ # Contribuciones de scraping</w:t>
+        <w:t xml:space="preserve">│   ├── David/, Jessi/, Jonatan/, Josue/ # Contribuciones de scraping (Juan David Cortés, Jessica Paola Vega, Jonatan Estiven Sánchez, Josue Duque)</w:t>
       </w:r>
       <w:r>
         <w:br/>

</xml_diff>